<commit_message>
docs: updated workshop manual docx
</commit_message>
<xml_diff>
--- a/bin/IP_Workshop_Manual.docx
+++ b/bin/IP_Workshop_Manual.docx
@@ -104,7 +104,7 @@
           <w:iCs/>
           <w:lang w:val="en-US"/>
         </w:rPr>
-        <w:t>Shweta Shimpi</w:t>
+        <w:t xml:space="preserve">Tanay Raul, </w:t>
       </w:r>
       <w:r>
         <w:rPr>
@@ -113,65 +113,16 @@
           <w:iCs/>
           <w:lang w:val="en-US"/>
         </w:rPr>
-        <w:t>, B.E. Computer Engineering</w:t>
+        <w:t>B.E. Com</w:t>
       </w:r>
-    </w:p>
-    <w:p>
-      <w:pPr>
-        <w:spacing w:after="0"/>
+      <w:r>
         <w:rPr>
           <w:rFonts w:ascii="Times New Roman" w:hAnsi="Times New Roman" w:cs="Times New Roman"/>
           <w:i/>
           <w:iCs/>
           <w:lang w:val="en-US"/>
         </w:rPr>
-      </w:pPr>
-      <w:r>
-        <w:rPr>
-          <w:rFonts w:ascii="Times New Roman" w:hAnsi="Times New Roman" w:cs="Times New Roman"/>
-          <w:i/>
-          <w:iCs/>
-          <w:lang w:val="en-US"/>
-        </w:rPr>
-        <w:t>Shreya Patil</w:t>
-      </w:r>
-      <w:r>
-        <w:rPr>
-          <w:rFonts w:ascii="Times New Roman" w:hAnsi="Times New Roman" w:cs="Times New Roman"/>
-          <w:i/>
-          <w:iCs/>
-          <w:lang w:val="en-US"/>
-        </w:rPr>
-        <w:t>, B.E. Computer Engineering</w:t>
-      </w:r>
-    </w:p>
-    <w:p>
-      <w:pPr>
-        <w:spacing w:after="0"/>
-        <w:rPr>
-          <w:rFonts w:ascii="Times New Roman" w:hAnsi="Times New Roman" w:cs="Times New Roman"/>
-          <w:i/>
-          <w:iCs/>
-          <w:lang w:val="en-US"/>
-        </w:rPr>
-      </w:pPr>
-      <w:r>
-        <w:rPr>
-          <w:rFonts w:ascii="Times New Roman" w:hAnsi="Times New Roman" w:cs="Times New Roman"/>
-          <w:i/>
-          <w:iCs/>
-          <w:lang w:val="en-US"/>
-        </w:rPr>
-        <w:t>Mandaar Pawar</w:t>
-      </w:r>
-      <w:r>
-        <w:rPr>
-          <w:rFonts w:ascii="Times New Roman" w:hAnsi="Times New Roman" w:cs="Times New Roman"/>
-          <w:i/>
-          <w:iCs/>
-          <w:lang w:val="en-US"/>
-        </w:rPr>
-        <w:t>, B.E. Computer Engineering</w:t>
+        <w:t>puter Engineering</w:t>
       </w:r>
     </w:p>
     <w:p>
@@ -280,23 +231,7 @@
           <w:rFonts w:ascii="Times New Roman" w:hAnsi="Times New Roman" w:cs="Times New Roman"/>
           <w:lang w:val="en-US"/>
         </w:rPr>
-        <w:t xml:space="preserve">Create React App: </w:t>
-      </w:r>
-      <w:proofErr w:type="spellStart"/>
-      <w:r>
-        <w:rPr>
-          <w:rFonts w:ascii="Times New Roman" w:hAnsi="Times New Roman" w:cs="Times New Roman"/>
-          <w:lang w:val="en-US"/>
-        </w:rPr>
-        <w:t>npx</w:t>
-      </w:r>
-      <w:proofErr w:type="spellEnd"/>
-      <w:r>
-        <w:rPr>
-          <w:rFonts w:ascii="Times New Roman" w:hAnsi="Times New Roman" w:cs="Times New Roman"/>
-          <w:lang w:val="en-US"/>
-        </w:rPr>
-        <w:t xml:space="preserve"> create-react-app frontend</w:t>
+        <w:t>Create React App: npx create-react-app frontend</w:t>
       </w:r>
     </w:p>
     <w:p>
@@ -317,33 +252,8 @@
           <w:rFonts w:ascii="Times New Roman" w:hAnsi="Times New Roman" w:cs="Times New Roman"/>
           <w:lang w:val="en-US"/>
         </w:rPr>
-        <w:t xml:space="preserve">Create Vite React: </w:t>
+        <w:t>Create Vite React: npm create vite@latest</w:t>
       </w:r>
-      <w:proofErr w:type="spellStart"/>
-      <w:r>
-        <w:rPr>
-          <w:rFonts w:ascii="Times New Roman" w:hAnsi="Times New Roman" w:cs="Times New Roman"/>
-          <w:lang w:val="en-US"/>
-        </w:rPr>
-        <w:t>npm</w:t>
-      </w:r>
-      <w:proofErr w:type="spellEnd"/>
-      <w:r>
-        <w:rPr>
-          <w:rFonts w:ascii="Times New Roman" w:hAnsi="Times New Roman" w:cs="Times New Roman"/>
-          <w:lang w:val="en-US"/>
-        </w:rPr>
-        <w:t xml:space="preserve"> create </w:t>
-      </w:r>
-      <w:proofErr w:type="spellStart"/>
-      <w:r>
-        <w:rPr>
-          <w:rFonts w:ascii="Times New Roman" w:hAnsi="Times New Roman" w:cs="Times New Roman"/>
-          <w:lang w:val="en-US"/>
-        </w:rPr>
-        <w:t>vite@latest</w:t>
-      </w:r>
-      <w:proofErr w:type="spellEnd"/>
     </w:p>
     <w:p>
       <w:pPr>
@@ -363,33 +273,8 @@
           <w:rFonts w:ascii="Times New Roman" w:hAnsi="Times New Roman" w:cs="Times New Roman"/>
           <w:lang w:val="en-US"/>
         </w:rPr>
-        <w:t xml:space="preserve">Install Axios for Frontend: </w:t>
+        <w:t>Install Axios for Frontend: npm install axios</w:t>
       </w:r>
-      <w:proofErr w:type="spellStart"/>
-      <w:r>
-        <w:rPr>
-          <w:rFonts w:ascii="Times New Roman" w:hAnsi="Times New Roman" w:cs="Times New Roman"/>
-          <w:lang w:val="en-US"/>
-        </w:rPr>
-        <w:t>npm</w:t>
-      </w:r>
-      <w:proofErr w:type="spellEnd"/>
-      <w:r>
-        <w:rPr>
-          <w:rFonts w:ascii="Times New Roman" w:hAnsi="Times New Roman" w:cs="Times New Roman"/>
-          <w:lang w:val="en-US"/>
-        </w:rPr>
-        <w:t xml:space="preserve"> install </w:t>
-      </w:r>
-      <w:proofErr w:type="spellStart"/>
-      <w:r>
-        <w:rPr>
-          <w:rFonts w:ascii="Times New Roman" w:hAnsi="Times New Roman" w:cs="Times New Roman"/>
-          <w:lang w:val="en-US"/>
-        </w:rPr>
-        <w:t>axios</w:t>
-      </w:r>
-      <w:proofErr w:type="spellEnd"/>
     </w:p>
     <w:p>
       <w:pPr>
@@ -409,55 +294,28 @@
           <w:rFonts w:ascii="Times New Roman" w:hAnsi="Times New Roman" w:cs="Times New Roman"/>
           <w:lang w:val="en-US"/>
         </w:rPr>
-        <w:t xml:space="preserve">Install Backend Dependencies: </w:t>
+        <w:t>Install Backend Dependencies: npm install express cors</w:t>
       </w:r>
-      <w:proofErr w:type="spellStart"/>
+    </w:p>
+    <w:p>
+      <w:pPr>
+        <w:pStyle w:val="ListParagraph"/>
+        <w:numPr>
+          <w:ilvl w:val="0"/>
+          <w:numId w:val="4"/>
+        </w:numPr>
+        <w:spacing w:after="0"/>
+        <w:rPr>
+          <w:rFonts w:ascii="Times New Roman" w:hAnsi="Times New Roman" w:cs="Times New Roman"/>
+          <w:lang w:val="en-US"/>
+        </w:rPr>
+      </w:pPr>
       <w:r>
         <w:rPr>
           <w:rFonts w:ascii="Times New Roman" w:hAnsi="Times New Roman" w:cs="Times New Roman"/>
           <w:lang w:val="en-US"/>
         </w:rPr>
-        <w:t>npm</w:t>
-      </w:r>
-      <w:proofErr w:type="spellEnd"/>
-      <w:r>
-        <w:rPr>
-          <w:rFonts w:ascii="Times New Roman" w:hAnsi="Times New Roman" w:cs="Times New Roman"/>
-          <w:lang w:val="en-US"/>
-        </w:rPr>
-        <w:t xml:space="preserve"> install </w:t>
-      </w:r>
-      <w:proofErr w:type="spellStart"/>
-      <w:r>
-        <w:rPr>
-          <w:rFonts w:ascii="Times New Roman" w:hAnsi="Times New Roman" w:cs="Times New Roman"/>
-          <w:lang w:val="en-US"/>
-        </w:rPr>
-        <w:t>nodemon</w:t>
-      </w:r>
-      <w:proofErr w:type="spellEnd"/>
-      <w:r>
-        <w:rPr>
-          <w:rFonts w:ascii="Times New Roman" w:hAnsi="Times New Roman" w:cs="Times New Roman"/>
-          <w:lang w:val="en-US"/>
-        </w:rPr>
-        <w:t xml:space="preserve"> express </w:t>
-      </w:r>
-      <w:proofErr w:type="spellStart"/>
-      <w:r>
-        <w:rPr>
-          <w:rFonts w:ascii="Times New Roman" w:hAnsi="Times New Roman" w:cs="Times New Roman"/>
-          <w:lang w:val="en-US"/>
-        </w:rPr>
-        <w:t>cors</w:t>
-      </w:r>
-      <w:proofErr w:type="spellEnd"/>
-      <w:r>
-        <w:rPr>
-          <w:rFonts w:ascii="Times New Roman" w:hAnsi="Times New Roman" w:cs="Times New Roman"/>
-          <w:lang w:val="en-US"/>
-        </w:rPr>
-        <w:t xml:space="preserve"> body-parser</w:t>
+        <w:t>Install nodemon: npm i -g nodemon</w:t>
       </w:r>
     </w:p>
     <w:p>
@@ -575,6 +433,7 @@
     </w:p>
     <w:p>
       <w:pPr>
+        <w:spacing w:after="0"/>
         <w:rPr>
           <w:rFonts w:ascii="Times New Roman" w:hAnsi="Times New Roman" w:cs="Times New Roman"/>
           <w:b/>
@@ -626,222 +485,78 @@
           <w:rFonts w:ascii="Times New Roman" w:hAnsi="Times New Roman" w:cs="Times New Roman"/>
           <w:lang w:val="en-US"/>
         </w:rPr>
-        <w:t>Features of React.js:</w:t>
+        <w:t>Components: Help to divide code into files so the code can be easily reused</w:t>
       </w:r>
     </w:p>
     <w:p>
       <w:pPr>
-        <w:pStyle w:val="NormalWeb"/>
+        <w:pStyle w:val="ListParagraph"/>
         <w:numPr>
           <w:ilvl w:val="0"/>
-          <w:numId w:val="3"/>
+          <w:numId w:val="7"/>
         </w:numPr>
-        <w:spacing w:before="0" w:beforeAutospacing="0" w:after="0" w:afterAutospacing="0"/>
+        <w:spacing w:after="0"/>
+        <w:rPr>
+          <w:rFonts w:ascii="Times New Roman" w:hAnsi="Times New Roman" w:cs="Times New Roman"/>
+          <w:lang w:val="en-US"/>
+        </w:rPr>
       </w:pPr>
       <w:r>
         <w:rPr>
-          <w:b/>
-          <w:bCs/>
-        </w:rPr>
-        <w:t>Virtual</w:t>
-      </w:r>
-      <w:r>
-        <w:rPr>
-          <w:rStyle w:val="Strong"/>
-          <w:rFonts w:eastAsiaTheme="majorEastAsia"/>
-          <w:b w:val="0"/>
-          <w:bCs w:val="0"/>
-        </w:rPr>
-        <w:t xml:space="preserve"> </w:t>
-      </w:r>
-      <w:r>
-        <w:rPr>
-          <w:rStyle w:val="Strong"/>
-          <w:rFonts w:eastAsiaTheme="majorEastAsia"/>
-        </w:rPr>
-        <w:t>DOM</w:t>
-      </w:r>
-      <w:r>
-        <w:t xml:space="preserve"> – React uses a virtual representation of the DOM to optimize updates. Instead of re-rendering the entire UI, it only updates the parts that </w:t>
-      </w:r>
-      <w:r>
-        <w:t>changed</w:t>
-      </w:r>
-      <w:r>
-        <w:t>, improving performance.</w:t>
+          <w:rFonts w:ascii="Times New Roman" w:hAnsi="Times New Roman" w:cs="Times New Roman"/>
+          <w:lang w:val="en-US"/>
+        </w:rPr>
+        <w:t>Props: Data passed to components to display it</w:t>
       </w:r>
     </w:p>
     <w:p>
       <w:pPr>
-        <w:pStyle w:val="NormalWeb"/>
+        <w:pStyle w:val="ListParagraph"/>
         <w:numPr>
           <w:ilvl w:val="0"/>
-          <w:numId w:val="3"/>
+          <w:numId w:val="7"/>
         </w:numPr>
-        <w:spacing w:before="0" w:beforeAutospacing="0" w:after="0" w:afterAutospacing="0"/>
+        <w:spacing w:after="0"/>
+        <w:rPr>
+          <w:rFonts w:ascii="Times New Roman" w:hAnsi="Times New Roman" w:cs="Times New Roman"/>
+          <w:lang w:val="en-US"/>
+        </w:rPr>
       </w:pPr>
       <w:r>
         <w:rPr>
-          <w:b/>
-          <w:bCs/>
-        </w:rPr>
-        <w:t>Component</w:t>
+          <w:rFonts w:ascii="Times New Roman" w:hAnsi="Times New Roman" w:cs="Times New Roman"/>
+          <w:lang w:val="en-US"/>
+        </w:rPr>
+        <w:t xml:space="preserve">Hooks: Used to manage state on the web and also perform actions if the state of a component </w:t>
       </w:r>
       <w:r>
         <w:rPr>
-          <w:rStyle w:val="Strong"/>
-          <w:rFonts w:eastAsiaTheme="majorEastAsia"/>
-          <w:b w:val="0"/>
-          <w:bCs w:val="0"/>
-        </w:rPr>
-        <w:t>-</w:t>
-      </w:r>
-      <w:r>
-        <w:rPr>
-          <w:rStyle w:val="Strong"/>
-          <w:rFonts w:eastAsiaTheme="majorEastAsia"/>
-        </w:rPr>
-        <w:t>Based Architecture</w:t>
-      </w:r>
-      <w:r>
-        <w:t xml:space="preserve"> </w:t>
-      </w:r>
-      <w:r>
-        <w:t>– UI is built using reusable, self-contained components. This makes code modular, easier to maintain, and encourages reusability.</w:t>
+          <w:rFonts w:ascii="Times New Roman" w:hAnsi="Times New Roman" w:cs="Times New Roman"/>
+          <w:lang w:val="en-US"/>
+        </w:rPr>
+        <w:t>changes</w:t>
       </w:r>
     </w:p>
     <w:p>
       <w:pPr>
-        <w:pStyle w:val="NormalWeb"/>
+        <w:pStyle w:val="ListParagraph"/>
         <w:numPr>
           <w:ilvl w:val="0"/>
-          <w:numId w:val="3"/>
+          <w:numId w:val="7"/>
         </w:numPr>
-        <w:spacing w:before="0" w:beforeAutospacing="0" w:after="0" w:afterAutospacing="0"/>
+        <w:spacing w:after="0"/>
+        <w:rPr>
+          <w:rFonts w:ascii="Times New Roman" w:hAnsi="Times New Roman" w:cs="Times New Roman"/>
+          <w:lang w:val="en-US"/>
+        </w:rPr>
       </w:pPr>
       <w:r>
         <w:rPr>
-          <w:b/>
-          <w:bCs/>
-        </w:rPr>
-        <w:t>JSX</w:t>
+          <w:rFonts w:ascii="Times New Roman" w:hAnsi="Times New Roman" w:cs="Times New Roman"/>
+          <w:lang w:val="en-US"/>
+        </w:rPr>
+        <w:t>API: Application Programming Interface, used to communicate and exchange data between different apps and frameworks.</w:t>
       </w:r>
-      <w:r>
-        <w:rPr>
-          <w:rStyle w:val="Strong"/>
-          <w:rFonts w:eastAsiaTheme="majorEastAsia"/>
-        </w:rPr>
-        <w:t xml:space="preserve"> (JavaScript XML)</w:t>
-      </w:r>
-      <w:r>
-        <w:t xml:space="preserve"> – React allows writing HTML-like syntax directly in JavaScript, which makes the code more readable and easier to understand.</w:t>
-      </w:r>
-    </w:p>
-    <w:p>
-      <w:pPr>
-        <w:pStyle w:val="NormalWeb"/>
-        <w:numPr>
-          <w:ilvl w:val="0"/>
-          <w:numId w:val="3"/>
-        </w:numPr>
-        <w:spacing w:before="0" w:beforeAutospacing="0" w:after="0" w:afterAutospacing="0"/>
-      </w:pPr>
-      <w:r>
-        <w:rPr>
-          <w:b/>
-          <w:bCs/>
-        </w:rPr>
-        <w:t>One</w:t>
-      </w:r>
-      <w:r>
-        <w:rPr>
-          <w:rStyle w:val="Strong"/>
-          <w:rFonts w:eastAsiaTheme="majorEastAsia"/>
-        </w:rPr>
-        <w:t>-Way Data Binding</w:t>
-      </w:r>
-      <w:r>
-        <w:t xml:space="preserve"> – Data flows in a single direction from parent to child components, making the app more predictable and easier to debug.</w:t>
-      </w:r>
-    </w:p>
-    <w:p>
-      <w:pPr>
-        <w:pStyle w:val="NormalWeb"/>
-        <w:numPr>
-          <w:ilvl w:val="0"/>
-          <w:numId w:val="3"/>
-        </w:numPr>
-        <w:spacing w:before="0" w:beforeAutospacing="0" w:after="0" w:afterAutospacing="0"/>
-      </w:pPr>
-      <w:r>
-        <w:rPr>
-          <w:b/>
-          <w:bCs/>
-        </w:rPr>
-        <w:t>Declarative</w:t>
-      </w:r>
-      <w:r>
-        <w:rPr>
-          <w:rStyle w:val="Strong"/>
-          <w:rFonts w:eastAsiaTheme="majorEastAsia"/>
-        </w:rPr>
-        <w:t xml:space="preserve"> UI</w:t>
-      </w:r>
-      <w:r>
-        <w:t xml:space="preserve"> – You describe </w:t>
-      </w:r>
-      <w:r>
-        <w:rPr>
-          <w:rStyle w:val="Emphasis"/>
-          <w:rFonts w:eastAsiaTheme="majorEastAsia"/>
-        </w:rPr>
-        <w:t>what</w:t>
-      </w:r>
-      <w:r>
-        <w:t xml:space="preserve"> the UI should look like for a given </w:t>
-      </w:r>
-      <w:r>
-        <w:t>state and</w:t>
-      </w:r>
-      <w:r>
-        <w:t xml:space="preserve"> React handles the rendering. This reduces bugs and makes UI logic easier to follow.</w:t>
-      </w:r>
-    </w:p>
-    <w:p>
-      <w:pPr>
-        <w:pStyle w:val="NormalWeb"/>
-        <w:numPr>
-          <w:ilvl w:val="0"/>
-          <w:numId w:val="3"/>
-        </w:numPr>
-        <w:spacing w:before="0" w:beforeAutospacing="0" w:after="0" w:afterAutospacing="0"/>
-      </w:pPr>
-      <w:r>
-        <w:rPr>
-          <w:b/>
-          <w:bCs/>
-        </w:rPr>
-        <w:t>React</w:t>
-      </w:r>
-      <w:r>
-        <w:rPr>
-          <w:rStyle w:val="Strong"/>
-          <w:rFonts w:eastAsiaTheme="majorEastAsia"/>
-        </w:rPr>
-        <w:t xml:space="preserve"> Hooks</w:t>
-      </w:r>
-      <w:r>
-        <w:t xml:space="preserve"> – Functional components can use state and other React features without writing class components, making code simpler and more modern.</w:t>
-      </w:r>
-    </w:p>
-    <w:p>
-      <w:pPr>
-        <w:ind w:left="720"/>
-        <w:rPr>
-          <w:rFonts w:ascii="Times New Roman" w:hAnsi="Times New Roman" w:cs="Times New Roman"/>
-          <w:lang w:val="en-US"/>
-        </w:rPr>
-      </w:pPr>
     </w:p>
     <w:sectPr>
       <w:pgSz w:w="11906" w:h="16838"/>

</xml_diff>

<commit_message>
flow finalised. workshop begins tomorrow
</commit_message>
<xml_diff>
--- a/bin/IP_Workshop_Manual.docx
+++ b/bin/IP_Workshop_Manual.docx
@@ -661,15 +661,13 @@
         </w:rPr>
         <w:t xml:space="preserve">Hooks: Used to manage state on the web </w:t>
       </w:r>
-      <w:proofErr w:type="gramStart"/>
-      <w:r>
-        <w:rPr>
-          <w:rFonts w:ascii="Times New Roman" w:hAnsi="Times New Roman" w:cs="Times New Roman"/>
-          <w:lang w:val="en-US"/>
-        </w:rPr>
-        <w:t>and also</w:t>
-      </w:r>
-      <w:proofErr w:type="gramEnd"/>
+      <w:r>
+        <w:rPr>
+          <w:rFonts w:ascii="Times New Roman" w:hAnsi="Times New Roman" w:cs="Times New Roman"/>
+          <w:lang w:val="en-US"/>
+        </w:rPr>
+        <w:t>and</w:t>
+      </w:r>
       <w:r>
         <w:rPr>
           <w:rFonts w:ascii="Times New Roman" w:hAnsi="Times New Roman" w:cs="Times New Roman"/>
@@ -677,7 +675,6 @@
         </w:rPr>
         <w:t xml:space="preserve"> perform actions if the state of a component </w:t>
       </w:r>
-      <w:proofErr w:type="gramStart"/>
       <w:r>
         <w:rPr>
           <w:rFonts w:ascii="Times New Roman" w:hAnsi="Times New Roman" w:cs="Times New Roman"/>
@@ -685,7 +682,6 @@
         </w:rPr>
         <w:t>changes</w:t>
       </w:r>
-      <w:proofErr w:type="gramEnd"/>
       <w:r>
         <w:rPr>
           <w:rFonts w:ascii="Times New Roman" w:hAnsi="Times New Roman" w:cs="Times New Roman"/>
@@ -693,7 +689,6 @@
         </w:rPr>
         <w:t xml:space="preserve"> [</w:t>
       </w:r>
-      <w:proofErr w:type="spellStart"/>
       <w:r>
         <w:rPr>
           <w:rFonts w:ascii="Times New Roman" w:hAnsi="Times New Roman" w:cs="Times New Roman"/>
@@ -701,37 +696,15 @@
           <w:bCs/>
           <w:lang w:val="en-US"/>
         </w:rPr>
-        <w:t>useState</w:t>
-      </w:r>
-      <w:proofErr w:type="spellEnd"/>
-      <w:r>
-        <w:rPr>
-          <w:rFonts w:ascii="Times New Roman" w:hAnsi="Times New Roman" w:cs="Times New Roman"/>
-          <w:b/>
-          <w:bCs/>
+        <w:t>useState, useEffect</w:t>
+      </w:r>
+      <w:r>
+        <w:rPr>
+          <w:rFonts w:ascii="Times New Roman" w:hAnsi="Times New Roman" w:cs="Times New Roman"/>
           <w:lang w:val="en-US"/>
         </w:rPr>
         <w:t xml:space="preserve">, </w:t>
       </w:r>
-      <w:proofErr w:type="spellStart"/>
-      <w:r>
-        <w:rPr>
-          <w:rFonts w:ascii="Times New Roman" w:hAnsi="Times New Roman" w:cs="Times New Roman"/>
-          <w:b/>
-          <w:bCs/>
-          <w:lang w:val="en-US"/>
-        </w:rPr>
-        <w:t>useEffect</w:t>
-      </w:r>
-      <w:proofErr w:type="spellEnd"/>
-      <w:r>
-        <w:rPr>
-          <w:rFonts w:ascii="Times New Roman" w:hAnsi="Times New Roman" w:cs="Times New Roman"/>
-          <w:lang w:val="en-US"/>
-        </w:rPr>
-        <w:t xml:space="preserve">, </w:t>
-      </w:r>
-      <w:proofErr w:type="spellStart"/>
       <w:r>
         <w:rPr>
           <w:rFonts w:ascii="Times New Roman" w:hAnsi="Times New Roman" w:cs="Times New Roman"/>
@@ -740,31 +713,8 @@
           <w:u w:val="single"/>
           <w:lang w:val="en-US"/>
         </w:rPr>
-        <w:t>useRef</w:t>
-      </w:r>
-      <w:proofErr w:type="spellEnd"/>
-      <w:r>
-        <w:rPr>
-          <w:rFonts w:ascii="Times New Roman" w:hAnsi="Times New Roman" w:cs="Times New Roman"/>
-          <w:i/>
-          <w:iCs/>
-          <w:u w:val="single"/>
-          <w:lang w:val="en-US"/>
-        </w:rPr>
-        <w:t xml:space="preserve">, </w:t>
-      </w:r>
-      <w:proofErr w:type="spellStart"/>
-      <w:r>
-        <w:rPr>
-          <w:rFonts w:ascii="Times New Roman" w:hAnsi="Times New Roman" w:cs="Times New Roman"/>
-          <w:i/>
-          <w:iCs/>
-          <w:u w:val="single"/>
-          <w:lang w:val="en-US"/>
-        </w:rPr>
-        <w:t>useMemo</w:t>
-      </w:r>
-      <w:proofErr w:type="spellEnd"/>
+        <w:t>useRef, useMemo</w:t>
+      </w:r>
       <w:r>
         <w:rPr>
           <w:rFonts w:ascii="Times New Roman" w:hAnsi="Times New Roman" w:cs="Times New Roman"/>
@@ -792,6 +742,211 @@
           <w:lang w:val="en-US"/>
         </w:rPr>
         <w:t>API: Application Programming Interface, used to communicate and exchange data between different apps and frameworks.</w:t>
+      </w:r>
+    </w:p>
+    <w:p>
+      <w:pPr>
+        <w:pStyle w:val="ListParagraph"/>
+        <w:numPr>
+          <w:ilvl w:val="0"/>
+          <w:numId w:val="7"/>
+        </w:numPr>
+        <w:spacing w:after="0"/>
+        <w:rPr>
+          <w:rFonts w:ascii="Times New Roman" w:hAnsi="Times New Roman" w:cs="Times New Roman"/>
+          <w:lang w:val="en-US"/>
+        </w:rPr>
+      </w:pPr>
+      <w:r>
+        <w:rPr>
+          <w:rFonts w:ascii="Times New Roman" w:hAnsi="Times New Roman" w:cs="Times New Roman"/>
+          <w:lang w:val="en-US"/>
+        </w:rPr>
+        <w:t>NodeJS:</w:t>
+      </w:r>
+      <w:r>
+        <w:rPr>
+          <w:rFonts w:ascii="Times New Roman" w:hAnsi="Times New Roman" w:cs="Times New Roman"/>
+          <w:lang w:val="en-US"/>
+        </w:rPr>
+        <w:t xml:space="preserve"> What is it and why?</w:t>
+      </w:r>
+    </w:p>
+    <w:p>
+      <w:pPr>
+        <w:pStyle w:val="ListParagraph"/>
+        <w:numPr>
+          <w:ilvl w:val="0"/>
+          <w:numId w:val="7"/>
+        </w:numPr>
+        <w:spacing w:after="0"/>
+        <w:rPr>
+          <w:rFonts w:ascii="Times New Roman" w:hAnsi="Times New Roman" w:cs="Times New Roman"/>
+          <w:lang w:val="en-US"/>
+        </w:rPr>
+      </w:pPr>
+      <w:r>
+        <w:rPr>
+          <w:rFonts w:ascii="Times New Roman" w:hAnsi="Times New Roman" w:cs="Times New Roman"/>
+          <w:lang w:val="en-US"/>
+        </w:rPr>
+        <w:t>ExpressJS:</w:t>
+      </w:r>
+      <w:r>
+        <w:rPr>
+          <w:rFonts w:ascii="Times New Roman" w:hAnsi="Times New Roman" w:cs="Times New Roman"/>
+          <w:lang w:val="en-US"/>
+        </w:rPr>
+        <w:t xml:space="preserve"> What is it and why?</w:t>
+      </w:r>
+    </w:p>
+    <w:p>
+      <w:pPr>
+        <w:pStyle w:val="ListParagraph"/>
+        <w:numPr>
+          <w:ilvl w:val="0"/>
+          <w:numId w:val="7"/>
+        </w:numPr>
+        <w:spacing w:after="0"/>
+        <w:rPr>
+          <w:rFonts w:ascii="Times New Roman" w:hAnsi="Times New Roman" w:cs="Times New Roman"/>
+          <w:lang w:val="en-US"/>
+        </w:rPr>
+      </w:pPr>
+      <w:r>
+        <w:rPr>
+          <w:rFonts w:ascii="Times New Roman" w:hAnsi="Times New Roman" w:cs="Times New Roman"/>
+          <w:lang w:val="en-US"/>
+        </w:rPr>
+        <w:t>Request types (REST APIs: GET, POST, PUT, DELETE)</w:t>
+      </w:r>
+    </w:p>
+    <w:p>
+      <w:pPr>
+        <w:spacing w:after="0"/>
+        <w:rPr>
+          <w:rFonts w:ascii="Times New Roman" w:hAnsi="Times New Roman" w:cs="Times New Roman"/>
+          <w:lang w:val="en-US"/>
+        </w:rPr>
+      </w:pPr>
+    </w:p>
+    <w:p>
+      <w:pPr>
+        <w:spacing w:after="0"/>
+        <w:rPr>
+          <w:rFonts w:ascii="Times New Roman" w:hAnsi="Times New Roman" w:cs="Times New Roman"/>
+          <w:b/>
+          <w:bCs/>
+          <w:sz w:val="36"/>
+          <w:szCs w:val="36"/>
+          <w:lang w:val="en-US"/>
+        </w:rPr>
+      </w:pPr>
+      <w:r>
+        <w:rPr>
+          <w:rFonts w:ascii="Times New Roman" w:hAnsi="Times New Roman" w:cs="Times New Roman"/>
+          <w:b/>
+          <w:bCs/>
+          <w:sz w:val="36"/>
+          <w:szCs w:val="36"/>
+          <w:lang w:val="en-US"/>
+        </w:rPr>
+        <w:t>React Flow</w:t>
+      </w:r>
+    </w:p>
+    <w:p>
+      <w:pPr>
+        <w:pStyle w:val="ListParagraph"/>
+        <w:numPr>
+          <w:ilvl w:val="0"/>
+          <w:numId w:val="8"/>
+        </w:numPr>
+        <w:spacing w:after="0"/>
+        <w:rPr>
+          <w:rFonts w:ascii="Times New Roman" w:hAnsi="Times New Roman" w:cs="Times New Roman"/>
+        </w:rPr>
+      </w:pPr>
+      <w:r>
+        <w:rPr>
+          <w:rFonts w:ascii="Times New Roman" w:hAnsi="Times New Roman" w:cs="Times New Roman"/>
+        </w:rPr>
+        <w:t>Explain React first</w:t>
+      </w:r>
+    </w:p>
+    <w:p>
+      <w:pPr>
+        <w:pStyle w:val="ListParagraph"/>
+        <w:numPr>
+          <w:ilvl w:val="0"/>
+          <w:numId w:val="8"/>
+        </w:numPr>
+        <w:spacing w:after="0"/>
+        <w:rPr>
+          <w:rFonts w:ascii="Times New Roman" w:hAnsi="Times New Roman" w:cs="Times New Roman"/>
+        </w:rPr>
+      </w:pPr>
+      <w:r>
+        <w:rPr>
+          <w:rFonts w:ascii="Times New Roman" w:hAnsi="Times New Roman" w:cs="Times New Roman"/>
+        </w:rPr>
+        <w:t>Explain React Components, their usage and why it's better than HTML</w:t>
+      </w:r>
+    </w:p>
+    <w:p>
+      <w:pPr>
+        <w:pStyle w:val="ListParagraph"/>
+        <w:numPr>
+          <w:ilvl w:val="0"/>
+          <w:numId w:val="8"/>
+        </w:numPr>
+        <w:spacing w:after="0"/>
+        <w:rPr>
+          <w:rFonts w:ascii="Times New Roman" w:hAnsi="Times New Roman" w:cs="Times New Roman"/>
+        </w:rPr>
+      </w:pPr>
+      <w:r>
+        <w:rPr>
+          <w:rFonts w:ascii="Times New Roman" w:hAnsi="Times New Roman" w:cs="Times New Roman"/>
+        </w:rPr>
+        <w:t>Explain React Props, how they are used to pass data and why (relate to components)</w:t>
+      </w:r>
+    </w:p>
+    <w:p>
+      <w:pPr>
+        <w:pStyle w:val="ListParagraph"/>
+        <w:numPr>
+          <w:ilvl w:val="0"/>
+          <w:numId w:val="8"/>
+        </w:numPr>
+        <w:spacing w:after="0"/>
+        <w:rPr>
+          <w:rFonts w:ascii="Times New Roman" w:hAnsi="Times New Roman" w:cs="Times New Roman"/>
+        </w:rPr>
+      </w:pPr>
+      <w:r>
+        <w:rPr>
+          <w:rFonts w:ascii="Times New Roman" w:hAnsi="Times New Roman" w:cs="Times New Roman"/>
+        </w:rPr>
+        <w:t>Hooks [useState, useEffect]</w:t>
+      </w:r>
+    </w:p>
+    <w:p>
+      <w:pPr>
+        <w:pStyle w:val="ListParagraph"/>
+        <w:numPr>
+          <w:ilvl w:val="0"/>
+          <w:numId w:val="8"/>
+        </w:numPr>
+        <w:spacing w:after="0"/>
+        <w:rPr>
+          <w:rFonts w:ascii="Times New Roman" w:hAnsi="Times New Roman" w:cs="Times New Roman"/>
+        </w:rPr>
+      </w:pPr>
+      <w:r>
+        <w:rPr>
+          <w:rFonts w:ascii="Times New Roman" w:hAnsi="Times New Roman" w:cs="Times New Roman"/>
+        </w:rPr>
+        <w:t>What are APIs, just the basics</w:t>
       </w:r>
     </w:p>
     <w:sectPr>
@@ -1188,6 +1343,92 @@
     </w:lvl>
   </w:abstractNum>
   <w:abstractNum w:abstractNumId="4" w15:restartNumberingAfterBreak="0">
+    <w:nsid w:val="6B921D12"/>
+    <w:multiLevelType w:val="hybridMultilevel"/>
+    <w:tmpl w:val="E842CB52"/>
+    <w:lvl w:ilvl="0" w:tplc="4009000F">
+      <w:start w:val="1"/>
+      <w:numFmt w:val="decimal"/>
+      <w:lvlText w:val="%1."/>
+      <w:lvlJc w:val="left"/>
+      <w:pPr>
+        <w:ind w:left="720" w:hanging="360"/>
+      </w:pPr>
+    </w:lvl>
+    <w:lvl w:ilvl="1" w:tplc="40090019" w:tentative="1">
+      <w:start w:val="1"/>
+      <w:numFmt w:val="lowerLetter"/>
+      <w:lvlText w:val="%2."/>
+      <w:lvlJc w:val="left"/>
+      <w:pPr>
+        <w:ind w:left="1440" w:hanging="360"/>
+      </w:pPr>
+    </w:lvl>
+    <w:lvl w:ilvl="2" w:tplc="4009001B" w:tentative="1">
+      <w:start w:val="1"/>
+      <w:numFmt w:val="lowerRoman"/>
+      <w:lvlText w:val="%3."/>
+      <w:lvlJc w:val="right"/>
+      <w:pPr>
+        <w:ind w:left="2160" w:hanging="180"/>
+      </w:pPr>
+    </w:lvl>
+    <w:lvl w:ilvl="3" w:tplc="4009000F" w:tentative="1">
+      <w:start w:val="1"/>
+      <w:numFmt w:val="decimal"/>
+      <w:lvlText w:val="%4."/>
+      <w:lvlJc w:val="left"/>
+      <w:pPr>
+        <w:ind w:left="2880" w:hanging="360"/>
+      </w:pPr>
+    </w:lvl>
+    <w:lvl w:ilvl="4" w:tplc="40090019" w:tentative="1">
+      <w:start w:val="1"/>
+      <w:numFmt w:val="lowerLetter"/>
+      <w:lvlText w:val="%5."/>
+      <w:lvlJc w:val="left"/>
+      <w:pPr>
+        <w:ind w:left="3600" w:hanging="360"/>
+      </w:pPr>
+    </w:lvl>
+    <w:lvl w:ilvl="5" w:tplc="4009001B" w:tentative="1">
+      <w:start w:val="1"/>
+      <w:numFmt w:val="lowerRoman"/>
+      <w:lvlText w:val="%6."/>
+      <w:lvlJc w:val="right"/>
+      <w:pPr>
+        <w:ind w:left="4320" w:hanging="180"/>
+      </w:pPr>
+    </w:lvl>
+    <w:lvl w:ilvl="6" w:tplc="4009000F" w:tentative="1">
+      <w:start w:val="1"/>
+      <w:numFmt w:val="decimal"/>
+      <w:lvlText w:val="%7."/>
+      <w:lvlJc w:val="left"/>
+      <w:pPr>
+        <w:ind w:left="5040" w:hanging="360"/>
+      </w:pPr>
+    </w:lvl>
+    <w:lvl w:ilvl="7" w:tplc="40090019" w:tentative="1">
+      <w:start w:val="1"/>
+      <w:numFmt w:val="lowerLetter"/>
+      <w:lvlText w:val="%8."/>
+      <w:lvlJc w:val="left"/>
+      <w:pPr>
+        <w:ind w:left="5760" w:hanging="360"/>
+      </w:pPr>
+    </w:lvl>
+    <w:lvl w:ilvl="8" w:tplc="4009001B" w:tentative="1">
+      <w:start w:val="1"/>
+      <w:numFmt w:val="lowerRoman"/>
+      <w:lvlText w:val="%9."/>
+      <w:lvlJc w:val="right"/>
+      <w:pPr>
+        <w:ind w:left="6480" w:hanging="180"/>
+      </w:pPr>
+    </w:lvl>
+  </w:abstractNum>
+  <w:abstractNum w:abstractNumId="5" w15:restartNumberingAfterBreak="0">
     <w:nsid w:val="6C9D18F2"/>
     <w:multiLevelType w:val="hybridMultilevel"/>
     <w:tmpl w:val="95149E9E"/>
@@ -1276,7 +1517,7 @@
       </w:pPr>
     </w:lvl>
   </w:abstractNum>
-  <w:abstractNum w:abstractNumId="5" w15:restartNumberingAfterBreak="0">
+  <w:abstractNum w:abstractNumId="6" w15:restartNumberingAfterBreak="0">
     <w:nsid w:val="6EA27E85"/>
     <w:multiLevelType w:val="hybridMultilevel"/>
     <w:tmpl w:val="4B02FA20"/>
@@ -1365,7 +1606,7 @@
       </w:pPr>
     </w:lvl>
   </w:abstractNum>
-  <w:abstractNum w:abstractNumId="6" w15:restartNumberingAfterBreak="0">
+  <w:abstractNum w:abstractNumId="7" w15:restartNumberingAfterBreak="0">
     <w:nsid w:val="6F2C302D"/>
     <w:multiLevelType w:val="hybridMultilevel"/>
     <w:tmpl w:val="74509892"/>
@@ -1455,7 +1696,7 @@
     </w:lvl>
   </w:abstractNum>
   <w:num w:numId="1" w16cid:durableId="5521306">
-    <w:abstractNumId w:val="5"/>
+    <w:abstractNumId w:val="6"/>
   </w:num>
   <w:num w:numId="2" w16cid:durableId="199365424">
     <w:abstractNumId w:val="2"/>
@@ -1464,7 +1705,7 @@
     <w:abstractNumId w:val="1"/>
   </w:num>
   <w:num w:numId="4" w16cid:durableId="1335643999">
-    <w:abstractNumId w:val="6"/>
+    <w:abstractNumId w:val="7"/>
   </w:num>
   <w:num w:numId="5" w16cid:durableId="1038818132">
     <w:abstractNumId w:val="0"/>
@@ -1473,6 +1714,9 @@
     <w:abstractNumId w:val="3"/>
   </w:num>
   <w:num w:numId="7" w16cid:durableId="17123034">
+    <w:abstractNumId w:val="5"/>
+  </w:num>
+  <w:num w:numId="8" w16cid:durableId="210503422">
     <w:abstractNumId w:val="4"/>
   </w:num>
 </w:numbering>
@@ -2081,7 +2325,6 @@
   <w:style w:type="character" w:default="1" w:styleId="DefaultParagraphFont">
     <w:name w:val="Default Paragraph Font"/>
     <w:uiPriority w:val="1"/>
-    <w:semiHidden/>
     <w:unhideWhenUsed/>
   </w:style>
   <w:style w:type="table" w:default="1" w:styleId="TableNormal">

</xml_diff>